<commit_message>
Cheque requisitions: Word invoices in text boxes, several PO numbers, plain-line invoices (#11)
- Word: text boxes (once each), page headers and footers, right-aligned and centred paragraphs, wide gaps of spaces, and month-first DATE fields are read.
- Several "PO #" numbers on one invoice all go on the requisition, and a course run on separate days lists every day in the description.
- An invoice with no item table gives its item, quantity and price; "Cheque payable to" names the payee.
- The PO line on the requisition is long enough for several numbers.

Co-Authored-By: Claude Opus 5.5 (1M context) <noreply@anthropic.com>
Claude-Session: https://claude.ai/code/session_01F3HvUpVn4mBhSBeGauijTb
</commit_message>
<xml_diff>
--- a/frontend/src/assets/templates/sicap-cheque-requisition.docx
+++ b/frontend/src/assets/templates/sicap-cheque-requisition.docx
@@ -685,7 +685,7 @@
                 <wp:positionV relativeFrom="paragraph">
                   <wp:posOffset>175895</wp:posOffset>
                 </wp:positionV>
-                <wp:extent cx="876300" cy="0"/>
+                <wp:extent cx="2286000" cy="0"/>
                 <wp:effectExtent l="0" t="0" r="0" b="0"/>
                 <wp:wrapNone/>
                 <wp:docPr id="1023337578" name="Straight Connector 18"/>
@@ -697,7 +697,7 @@
                       <wps:spPr>
                         <a:xfrm>
                           <a:off x="0" y="0"/>
-                          <a:ext cx="876300" cy="0"/>
+                          <a:ext cx="2286000" cy="0"/>
                         </a:xfrm>
                         <a:prstGeom prst="line">
                           <a:avLst/>
@@ -726,7 +726,7 @@
           </mc:Choice>
           <mc:Fallback>
             <w:pict>
-              <v:line w14:anchorId="11233C7E" id="Straight Connector 18" o:spid="_x0000_s1026" style="position:absolute;z-index:251672576;visibility:visible;mso-wrap-style:square;mso-wrap-distance-left:9pt;mso-wrap-distance-top:0;mso-wrap-distance-right:9pt;mso-wrap-distance-bottom:0;mso-position-horizontal:absolute;mso-position-horizontal-relative:text;mso-position-vertical:absolute;mso-position-vertical-relative:text" from="114pt,13.85pt" to="183pt,13.85pt" o:gfxdata="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" strokecolor="black [3200]" strokeweight=".5pt">
+              <v:line w14:anchorId="11233C7E" id="Straight Connector 18" o:spid="_x0000_s1026" style="position:absolute;z-index:251672576;visibility:visible;mso-wrap-style:square;mso-wrap-distance-left:9pt;mso-wrap-distance-top:0;mso-wrap-distance-right:9pt;mso-wrap-distance-bottom:0;mso-position-horizontal:absolute;mso-position-horizontal-relative:text;mso-position-vertical:absolute;mso-position-vertical-relative:text" from="114pt,13.85pt" to="294pt,13.85pt" o:gfxdata="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" strokecolor="black [3200]" strokeweight=".5pt">
                 <v:stroke joinstyle="miter"/>
               </v:line>
             </w:pict>

</xml_diff>